<commit_message>
Tighten recipient spacing defaults
</commit_message>
<xml_diff>
--- a/demo/online/notice-通知/20260404-关于开展“我的刀盾”传播素材整理工作的通知-v01.docx
+++ b/demo/online/notice-通知/20260404-关于开展“我的刀盾”传播素材整理工作的通知-v01.docx
@@ -5,7 +5,7 @@
     <w:p>
       <w:pPr>
         <w:jc w:val="center"/>
-        <w:spacing w:before="0" w:after="580" w:line="580" w:lineRule="exact"/>
+        <w:spacing w:before="0" w:after="579" w:line="579" w:lineRule="exact"/>
       </w:pPr>
       <w:r>
         <w:rPr>
@@ -20,7 +20,7 @@
     </w:p>
     <w:p>
       <w:pPr>
-        <w:spacing w:before="0" w:after="580" w:line="580" w:lineRule="exact"/>
+        <w:spacing w:before="0" w:after="0" w:line="579" w:lineRule="exact"/>
       </w:pPr>
       <w:r>
         <w:rPr>
@@ -34,7 +34,7 @@
     <w:p>
       <w:pPr>
         <w:ind w:firstLineChars="200" w:firstLine="632"/>
-        <w:spacing w:before="0" w:after="0" w:line="580" w:lineRule="exact"/>
+        <w:spacing w:before="0" w:after="0" w:line="579" w:lineRule="exact"/>
       </w:pPr>
       <w:r>
         <w:rPr>
@@ -48,7 +48,7 @@
     <w:p>
       <w:pPr>
         <w:ind w:firstLineChars="200" w:firstLine="632"/>
-        <w:spacing w:before="0" w:after="0" w:line="580" w:lineRule="exact"/>
+        <w:spacing w:before="0" w:after="0" w:line="579" w:lineRule="exact"/>
       </w:pPr>
       <w:r>
         <w:rPr>
@@ -62,7 +62,7 @@
     <w:p>
       <w:pPr>
         <w:ind w:firstLineChars="200" w:firstLine="632"/>
-        <w:spacing w:before="0" w:after="0" w:line="580" w:lineRule="exact"/>
+        <w:spacing w:before="0" w:after="0" w:line="579" w:lineRule="exact"/>
       </w:pPr>
       <w:r>
         <w:rPr>
@@ -76,7 +76,7 @@
     <w:p>
       <w:pPr>
         <w:ind w:firstLineChars="200" w:firstLine="632"/>
-        <w:spacing w:before="0" w:after="0" w:line="580" w:lineRule="exact"/>
+        <w:spacing w:before="0" w:after="0" w:line="579" w:lineRule="exact"/>
       </w:pPr>
       <w:r>
         <w:rPr>
@@ -90,7 +90,7 @@
     <w:p>
       <w:pPr>
         <w:ind w:firstLineChars="200" w:firstLine="632"/>
-        <w:spacing w:before="0" w:after="0" w:line="580" w:lineRule="exact"/>
+        <w:spacing w:before="0" w:after="0" w:line="579" w:lineRule="exact"/>
       </w:pPr>
       <w:r>
         <w:rPr>
@@ -105,7 +105,7 @@
       <w:pPr>
         <w:jc w:val="right"/>
         <w:ind w:rightChars="200" w:right="632"/>
-        <w:spacing w:before="1740" w:after="0" w:line="580" w:lineRule="exact"/>
+        <w:spacing w:before="1740" w:after="0" w:line="579" w:lineRule="exact"/>
       </w:pPr>
       <w:r>
         <w:rPr>
@@ -120,7 +120,7 @@
       <w:pPr>
         <w:jc w:val="right"/>
         <w:ind w:rightChars="400" w:right="1264"/>
-        <w:spacing w:before="0" w:after="0" w:line="580" w:lineRule="exact"/>
+        <w:spacing w:before="0" w:after="0" w:line="579" w:lineRule="exact"/>
       </w:pPr>
       <w:r>
         <w:rPr>
@@ -134,7 +134,7 @@
     <w:p>
       <w:pPr>
         <w:ind w:leftChars="200" w:left="632"/>
-        <w:spacing w:before="0" w:after="0" w:line="580" w:lineRule="exact"/>
+        <w:spacing w:before="0" w:after="0" w:line="579" w:lineRule="exact"/>
       </w:pPr>
       <w:r>
         <w:rPr>
@@ -229,7 +229,7 @@
     </w:rPrDefault>
     <w:pPrDefault>
       <w:pPr>
-        <w:spacing w:line="580" w:lineRule="exact"/>
+        <w:spacing w:line="579" w:lineRule="exact"/>
       </w:pPr>
     </w:pPrDefault>
   </w:docDefaults>

</xml_diff>